<commit_message>
Add hackathon results and move Pokemon research
</commit_message>
<xml_diff>
--- a/resume/Karandeep_Singh_Resume.docx
+++ b/resume/Karandeep_Singh_Resume.docx
@@ -1043,7 +1043,7 @@
           <w:szCs w:val="22"/>
           <w:rtl w:val="0"/>
         </w:rPr>
-        <w:t>2026</w:t>
+        <w:t>June – Sep 2026</w:t>
       </w:r>
       <w:r>
         <w:rPr>
@@ -2980,7 +2980,7 @@
           <w:szCs w:val="24"/>
           <w:rtl w:val="0"/>
         </w:rPr>
-        <w:t xml:space="preserve">CERTIFICATIONS</w:t>
+        <w:t>HACKATHONS &amp; COMPETITIONS</w:t>
       </w:r>
       <w:r>
         <w:rPr>
@@ -2998,118 +2998,12 @@
           <w:szCs w:val="22"/>
         </w:rPr>
       </w:pPr>
-      <w:hyperlink r:id="rId26">
-        <w:r>
-          <w:rPr>
-            <w:rFonts w:ascii="Calibri" w:cs="Calibri" w:eastAsia="Calibri" w:hAnsi="Calibri"/>
-            <w:color w:val="1f3864"/>
-            <w:sz w:val="22"/>
-            <w:szCs w:val="22"/>
-            <w:u w:val="single"/>
-            <w:rtl w:val="0"/>
-          </w:rPr>
-          <w:t xml:space="preserve">Hacking and Patching</w:t>
-        </w:r>
-      </w:hyperlink>
-      <w:r>
-        <w:rPr>
-          <w:rFonts w:ascii="Calibri" w:cs="Calibri" w:eastAsia="Calibri" w:hAnsi="Calibri"/>
-          <w:color w:val="1f3864"/>
-          <w:sz w:val="22"/>
-          <w:szCs w:val="22"/>
-          <w:rtl w:val="0"/>
-        </w:rPr>
-        <w:t xml:space="preserve"> (CU Boulder)</w:t>
-      </w:r>
-      <w:r>
-        <w:rPr>
-          <w:rFonts w:ascii="Calibri" w:cs="Calibri" w:eastAsia="Calibri" w:hAnsi="Calibri"/>
-          <w:b w:val="1"/>
-          <w:bCs w:val="1"/>
-          <w:color w:val="1f3864"/>
-          <w:sz w:val="22"/>
-          <w:szCs w:val="22"/>
-          <w:rtl w:val="0"/>
-        </w:rPr>
-        <w:t xml:space="preserve"> ·</w:t>
-      </w:r>
-      <w:r>
-        <w:rPr>
-          <w:rFonts w:ascii="Calibri" w:cs="Calibri" w:eastAsia="Calibri" w:hAnsi="Calibri"/>
-          <w:color w:val="1f3864"/>
-          <w:sz w:val="22"/>
-          <w:szCs w:val="22"/>
-          <w:rtl w:val="0"/>
-        </w:rPr>
-        <w:t xml:space="preserve"> </w:t>
-      </w:r>
-      <w:hyperlink r:id="rId27">
-        <w:r>
-          <w:rPr>
-            <w:rFonts w:ascii="Calibri" w:cs="Calibri" w:eastAsia="Calibri" w:hAnsi="Calibri"/>
-            <w:color w:val="1f3864"/>
-            <w:sz w:val="22"/>
-            <w:szCs w:val="22"/>
-            <w:u w:val="single"/>
-            <w:rtl w:val="0"/>
-          </w:rPr>
-          <w:t xml:space="preserve">Foundations of Cybersecurity</w:t>
-        </w:r>
-      </w:hyperlink>
-      <w:r>
-        <w:rPr>
-          <w:rFonts w:ascii="Calibri" w:cs="Calibri" w:eastAsia="Calibri" w:hAnsi="Calibri"/>
-          <w:color w:val="1f3864"/>
-          <w:sz w:val="22"/>
-          <w:szCs w:val="22"/>
-          <w:rtl w:val="0"/>
-        </w:rPr>
-        <w:t xml:space="preserve"> (Google</w:t>
-      </w:r>
-      <w:r>
-        <w:rPr>
-          <w:rFonts w:ascii="Calibri" w:cs="Calibri" w:eastAsia="Calibri" w:hAnsi="Calibri"/>
-          <w:b w:val="1"/>
-          <w:bCs w:val="1"/>
-          <w:color w:val="1f3864"/>
-          <w:sz w:val="22"/>
-          <w:szCs w:val="22"/>
-          <w:rtl w:val="0"/>
-        </w:rPr>
-        <w:t xml:space="preserve">) ·</w:t>
-      </w:r>
-      <w:r>
-        <w:rPr>
-          <w:rFonts w:ascii="Calibri" w:cs="Calibri" w:eastAsia="Calibri" w:hAnsi="Calibri"/>
-          <w:color w:val="1f3864"/>
-          <w:sz w:val="22"/>
-          <w:szCs w:val="22"/>
-          <w:rtl w:val="0"/>
-        </w:rPr>
-        <w:t xml:space="preserve"> </w:t>
-      </w:r>
-      <w:hyperlink r:id="rId29">
-        <w:r>
-          <w:rPr>
-            <w:rFonts w:ascii="Calibri" w:cs="Calibri" w:eastAsia="Calibri" w:hAnsi="Calibri"/>
-            <w:color w:val="1f3864"/>
-            <w:sz w:val="22"/>
-            <w:szCs w:val="22"/>
-            <w:u w:val="single"/>
-            <w:rtl w:val="0"/>
-          </w:rPr>
-          <w:t xml:space="preserve">Blockchain Specialization</w:t>
-        </w:r>
-      </w:hyperlink>
-      <w:r>
-        <w:rPr>
-          <w:rFonts w:ascii="Calibri" w:cs="Calibri" w:eastAsia="Calibri" w:hAnsi="Calibri"/>
-          <w:color w:val="1f3864"/>
-          <w:sz w:val="22"/>
-          <w:szCs w:val="22"/>
-          <w:rtl w:val="0"/>
-        </w:rPr>
-        <w:t xml:space="preserve">, 4 courses (SUNY Buffalo)</w:t>
+      <w:r>
+        <w:rPr>
+          <w:rFonts w:ascii="Calibri" w:hAnsi="Calibri"/>
+          <w:sz w:val="22"/>
+        </w:rPr>
+        <w:t>Runner-up, 24-hr Hackathon — ADVITIYA Techfest, IIT Ropar · 2nd Place, The Geek Showdown Hackathon, CGC Landran · Winner, Code Debugging &amp; Software Showcase, PLASMA Techfest</w:t>
       </w:r>
     </w:p>
     <w:sectPr>

</xml_diff>

<commit_message>
Finalize Pokemon research links and resume
</commit_message>
<xml_diff>
--- a/resume/Karandeep_Singh_Resume.docx
+++ b/resume/Karandeep_Singh_Resume.docx
@@ -1092,7 +1092,7 @@
           <w:vertAlign w:val="baseline"/>
           <w:rtl w:val="0"/>
         </w:rPr>
-        <w:t xml:space="preserve">Trained a Transformer game agent through self-play to make decisions with hidden information; placed 19th of 6,807 teams in Simulation and 12th in Strategy. </w:t>
+        <w:t xml:space="preserve">Placed 19th of 6,807 teams in Simulation and 12th in Strategy with a Transformer agent trained through self-play to account for unseen opponent cards. </w:t>
       </w:r>
       <w:hyperlink r:id="rId30">
         <w:r>
@@ -3004,6 +3004,148 @@
           <w:sz w:val="22"/>
         </w:rPr>
         <w:t>Runner-up, 24-hr Hackathon — ADVITIYA Techfest, IIT Ropar · 2nd Place, The Geek Showdown Hackathon, CGC Landran · Winner, Code Debugging &amp; Software Showcase, PLASMA Techfest</w:t>
+      </w:r>
+    </w:p>
+    <w:p>
+      <w:pPr>
+        <w:pBdr>
+          <w:bottom w:color="1f3864" w:space="2" w:sz="4" w:val="single"/>
+        </w:pBdr>
+        <w:spacing w:after="100" w:before="160" w:lineRule="auto"/>
+        <w:rPr>
+          <w:sz w:val="24"/>
+          <w:szCs w:val="24"/>
+        </w:rPr>
+      </w:pPr>
+      <w:r>
+        <w:rPr>
+          <w:rFonts w:ascii="Calibri" w:cs="Calibri" w:eastAsia="Calibri" w:hAnsi="Calibri"/>
+          <w:b w:val="1"/>
+          <w:bCs w:val="1"/>
+          <w:smallCaps w:val="1"/>
+          <w:color w:val="1f3864"/>
+          <w:sz w:val="24"/>
+          <w:szCs w:val="24"/>
+          <w:rtl w:val="0"/>
+        </w:rPr>
+        <w:t>CERTIFICATIONS</w:t>
+      </w:r>
+    </w:p>
+    <w:p>
+      <w:pPr>
+        <w:spacing w:after="0" w:before="26" w:lineRule="auto"/>
+        <w:rPr>
+          <w:rFonts w:ascii="Calibri" w:cs="Calibri" w:eastAsia="Calibri" w:hAnsi="Calibri"/>
+          <w:color w:val="1f3864"/>
+          <w:sz w:val="22"/>
+          <w:szCs w:val="22"/>
+        </w:rPr>
+      </w:pPr>
+      <w:hyperlink r:id="rId26">
+        <w:r>
+          <w:rPr>
+            <w:rFonts w:ascii="Calibri" w:cs="Calibri" w:eastAsia="Calibri" w:hAnsi="Calibri"/>
+            <w:color w:val="1f3864"/>
+            <w:sz w:val="22"/>
+            <w:szCs w:val="22"/>
+            <w:u w:val="single"/>
+            <w:rtl w:val="0"/>
+          </w:rPr>
+          <w:t xml:space="preserve">Hacking and Patching</w:t>
+        </w:r>
+      </w:hyperlink>
+      <w:r>
+        <w:rPr>
+          <w:rFonts w:ascii="Calibri" w:cs="Calibri" w:eastAsia="Calibri" w:hAnsi="Calibri"/>
+          <w:color w:val="1f3864"/>
+          <w:sz w:val="22"/>
+          <w:szCs w:val="22"/>
+          <w:rtl w:val="0"/>
+        </w:rPr>
+        <w:t xml:space="preserve"> (CU Boulder)</w:t>
+      </w:r>
+      <w:r>
+        <w:rPr>
+          <w:rFonts w:ascii="Calibri" w:cs="Calibri" w:eastAsia="Calibri" w:hAnsi="Calibri"/>
+          <w:b w:val="1"/>
+          <w:bCs w:val="1"/>
+          <w:color w:val="1f3864"/>
+          <w:sz w:val="22"/>
+          <w:szCs w:val="22"/>
+          <w:rtl w:val="0"/>
+        </w:rPr>
+        <w:t xml:space="preserve"> ·</w:t>
+      </w:r>
+      <w:r>
+        <w:rPr>
+          <w:rFonts w:ascii="Calibri" w:cs="Calibri" w:eastAsia="Calibri" w:hAnsi="Calibri"/>
+          <w:color w:val="1f3864"/>
+          <w:sz w:val="22"/>
+          <w:szCs w:val="22"/>
+          <w:rtl w:val="0"/>
+        </w:rPr>
+        <w:t xml:space="preserve"> </w:t>
+      </w:r>
+      <w:hyperlink r:id="rId27">
+        <w:r>
+          <w:rPr>
+            <w:rFonts w:ascii="Calibri" w:cs="Calibri" w:eastAsia="Calibri" w:hAnsi="Calibri"/>
+            <w:color w:val="1f3864"/>
+            <w:sz w:val="22"/>
+            <w:szCs w:val="22"/>
+            <w:u w:val="single"/>
+            <w:rtl w:val="0"/>
+          </w:rPr>
+          <w:t xml:space="preserve">Foundations of Cybersecurity</w:t>
+        </w:r>
+      </w:hyperlink>
+      <w:r>
+        <w:rPr>
+          <w:rFonts w:ascii="Calibri" w:cs="Calibri" w:eastAsia="Calibri" w:hAnsi="Calibri"/>
+          <w:color w:val="1f3864"/>
+          <w:sz w:val="22"/>
+          <w:szCs w:val="22"/>
+          <w:rtl w:val="0"/>
+        </w:rPr>
+        <w:t xml:space="preserve"> (Google</w:t>
+      </w:r>
+      <w:r>
+        <w:rPr>
+          <w:rFonts w:ascii="Calibri" w:cs="Calibri" w:eastAsia="Calibri" w:hAnsi="Calibri"/>
+          <w:b w:val="1"/>
+          <w:bCs w:val="1"/>
+          <w:color w:val="1f3864"/>
+          <w:sz w:val="22"/>
+          <w:szCs w:val="22"/>
+          <w:rtl w:val="0"/>
+        </w:rPr>
+        <w:t xml:space="preserve">)</w:t>
+      </w:r>
+      <w:r>
+        <w:br/>
+      </w:r>
+      <w:hyperlink r:id="rId29">
+        <w:r>
+          <w:rPr>
+            <w:rFonts w:ascii="Calibri" w:cs="Calibri" w:eastAsia="Calibri" w:hAnsi="Calibri"/>
+            <w:color w:val="1f3864"/>
+            <w:sz w:val="22"/>
+            <w:szCs w:val="22"/>
+            <w:u w:val="single"/>
+            <w:rtl w:val="0"/>
+          </w:rPr>
+          <w:t xml:space="preserve">Blockchain Specialization</w:t>
+        </w:r>
+      </w:hyperlink>
+      <w:r>
+        <w:rPr>
+          <w:rFonts w:ascii="Calibri" w:cs="Calibri" w:eastAsia="Calibri" w:hAnsi="Calibri"/>
+          <w:color w:val="1f3864"/>
+          <w:sz w:val="22"/>
+          <w:szCs w:val="22"/>
+          <w:rtl w:val="0"/>
+        </w:rPr>
+        <w:t xml:space="preserve">, 4 courses (SUNY Buffalo)</w:t>
       </w:r>
     </w:p>
     <w:sectPr>

</xml_diff>